<commit_message>
Codex-Bericht (Rolle X) als siebten Bericht eingearbeitet: Vorlage Ä1 bis Ä30, Bündelung, Protokolle
Co-Authored-By: Claude Opus 5.5 <noreply@anthropic.com>
Claude-Session: https://claude.ai/code/session_01H6HhHh1SmuARGHNzYGswr7
</commit_message>
<xml_diff>
--- a/ergebnisse/kaffee/protokolle/Entscheidungsprotokoll_2026-10-29.docx
+++ b/ergebnisse/kaffee/protokolle/Entscheidungsprotokoll_2026-10-29.docx
@@ -6847,7 +6847,7 @@
                 <w:sz w:val="17"/>
                 <w:szCs w:val="17"/>
               </w:rPr>
-              <w:t xml:space="preserve">Prüfberichte P, T, D, R, S und G vom 29.10.2026: unabhängige Prüfung der Kaffee-Aufgabe mit sechs Rollen, je mit eigener Leseliste, eigenem Materialordner und eigener Nachrechnung; Bündelung zu den Änderungsvorschlägen Ä1 bis Ä29 mit Nachrechnung aller Zahlen durch die Koordination (KI-Protokoll K34 und Abschnitt 3.7; Berichte, Bündelung und Vorlage im Repository unter ergebnisse/kaffee/ und im Tab „Änderungsvorschläge“ des Claude-Dokuments)</w:t>
+              <w:t xml:space="preserve">Prüfberichte P, T, D, R, S und G vom 29.10.2026 und Bericht von Codex (Rolle X) vom 30.10.2026: unabhängige Prüfung der Kaffee-Aufgabe mit sechs Rollen, je mit eigener Leseliste, eigenem Materialordner und eigener Nachrechnung, dazu die Gegenprüfung durch Codex; Bündelung zu den Änderungsvorschlägen Ä1 bis Ä30 mit Nachrechnung aller Zahlen durch die Koordination (KI-Protokoll K34 und Abschnitt 3.7; Berichte, Bündelung und Vorlage im Repository unter ergebnisse/kaffee/ und im Tab „Änderungsvorschläge“ des Claude-Dokuments)</w:t>
             </w:r>
           </w:p>
         </w:tc>
@@ -28677,7 +28677,7 @@
                 <w:sz w:val="16"/>
                 <w:szCs w:val="16"/>
               </w:rPr>
-              <w:t xml:space="preserve">umgesetzt (29.10.2026, Cloud-Sitzung statt Chat, K34); Entscheidung über Ä1 bis Ä29 offen</w:t>
+              <w:t xml:space="preserve">umgesetzt (29.10.2026, Cloud-Sitzung statt Chat, K34); Entscheidung über Ä1 bis Ä30 offen</w:t>
             </w:r>
           </w:p>
         </w:tc>
@@ -29763,7 +29763,7 @@
         <w:jc w:val="left"/>
       </w:pPr>
       <w:r>
-        <w:t xml:space="preserve">Über die Änderungsvorschläge Ä1 bis Ä29 zur Kaffee-Aufgabe entscheiden (Tab „Änderungsvorschläge“, G40); Bericht von Codex (Rolle X) nachtragen</w:t>
+        <w:t xml:space="preserve">Über die Änderungsvorschläge Ä1 bis Ä30 zur Kaffee-Aufgabe entscheiden (Tab „Änderungsvorschläge“, G40)</w:t>
       </w:r>
     </w:p>
     <w:p>

</xml_diff>